<commit_message>
feat: Actualización Historias de usuario
</commit_message>
<xml_diff>
--- a/Informes/Historias de Usuario.docx
+++ b/Informes/Historias de Usuario.docx
@@ -5,6 +5,10 @@
     <w:p>
       <w:pPr>
         <w:spacing w:after="0"/>
+        <w:rPr>
+          <w:b/>
+          <w:bCs/>
+        </w:rPr>
       </w:pPr>
       <w:r>
         <w:rPr>
@@ -13,6 +17,11 @@
         </w:rPr>
         <w:t>Reglas de Oro y Acuerdos</w:t>
       </w:r>
+    </w:p>
+    <w:p>
+      <w:pPr>
+        <w:spacing w:after="0"/>
+      </w:pPr>
     </w:p>
     <w:p>
       <w:pPr>
@@ -209,8 +218,8 @@
         <w:tblLook w:val="04A0" w:firstRow="1" w:lastRow="0" w:firstColumn="1" w:lastColumn="0" w:noHBand="0" w:noVBand="1"/>
       </w:tblPr>
       <w:tblGrid>
-        <w:gridCol w:w="1154"/>
-        <w:gridCol w:w="6773"/>
+        <w:gridCol w:w="2453"/>
+        <w:gridCol w:w="6375"/>
       </w:tblGrid>
       <w:tr>
         <w:trPr>
@@ -228,8 +237,6 @@
                 <w:rFonts w:ascii="Aptos Narrow" w:eastAsia="Times New Roman" w:hAnsi="Aptos Narrow" w:cs="Times New Roman"/>
                 <w:color w:val="000000"/>
                 <w:kern w:val="0"/>
-                <w:sz w:val="22"/>
-                <w:szCs w:val="22"/>
                 <w:lang w:eastAsia="es-CO"/>
                 <w14:ligatures w14:val="none"/>
               </w:rPr>
@@ -239,12 +246,26 @@
                 <w:rFonts w:ascii="Aptos Narrow" w:eastAsia="Times New Roman" w:hAnsi="Aptos Narrow" w:cs="Times New Roman"/>
                 <w:color w:val="000000"/>
                 <w:kern w:val="0"/>
-                <w:sz w:val="22"/>
-                <w:szCs w:val="22"/>
                 <w:lang w:eastAsia="es-CO"/>
                 <w14:ligatures w14:val="none"/>
               </w:rPr>
-              <w:t>T1 (todos):</w:t>
+              <w:t>T1 (</w:t>
+            </w:r>
+            <w:r>
+              <w:rPr>
+                <w:lang w:eastAsia="es-CO"/>
+              </w:rPr>
+              <w:t>Fernanda Aristizabal</w:t>
+            </w:r>
+            <w:r>
+              <w:rPr>
+                <w:rFonts w:ascii="Aptos Narrow" w:eastAsia="Times New Roman" w:hAnsi="Aptos Narrow" w:cs="Times New Roman"/>
+                <w:color w:val="000000"/>
+                <w:kern w:val="0"/>
+                <w:lang w:eastAsia="es-CO"/>
+                <w14:ligatures w14:val="none"/>
+              </w:rPr>
+              <w:t>):</w:t>
             </w:r>
           </w:p>
         </w:tc>
@@ -260,8 +281,6 @@
                 <w:rFonts w:ascii="Aptos Narrow" w:eastAsia="Times New Roman" w:hAnsi="Aptos Narrow" w:cs="Times New Roman"/>
                 <w:color w:val="000000"/>
                 <w:kern w:val="0"/>
-                <w:sz w:val="22"/>
-                <w:szCs w:val="22"/>
                 <w:lang w:eastAsia="es-CO"/>
                 <w14:ligatures w14:val="none"/>
               </w:rPr>
@@ -271,8 +290,6 @@
                 <w:rFonts w:ascii="Aptos Narrow" w:eastAsia="Times New Roman" w:hAnsi="Aptos Narrow" w:cs="Times New Roman"/>
                 <w:color w:val="000000"/>
                 <w:kern w:val="0"/>
-                <w:sz w:val="22"/>
-                <w:szCs w:val="22"/>
                 <w:lang w:eastAsia="es-CO"/>
                 <w14:ligatures w14:val="none"/>
               </w:rPr>
@@ -284,8 +301,6 @@
                 <w:rFonts w:ascii="Aptos Narrow" w:eastAsia="Times New Roman" w:hAnsi="Aptos Narrow" w:cs="Times New Roman"/>
                 <w:color w:val="000000"/>
                 <w:kern w:val="0"/>
-                <w:sz w:val="22"/>
-                <w:szCs w:val="22"/>
                 <w:lang w:eastAsia="es-CO"/>
                 <w14:ligatures w14:val="none"/>
               </w:rPr>
@@ -297,8 +312,6 @@
                 <w:rFonts w:ascii="Aptos Narrow" w:eastAsia="Times New Roman" w:hAnsi="Aptos Narrow" w:cs="Times New Roman"/>
                 <w:color w:val="000000"/>
                 <w:kern w:val="0"/>
-                <w:sz w:val="22"/>
-                <w:szCs w:val="22"/>
                 <w:lang w:eastAsia="es-CO"/>
                 <w14:ligatures w14:val="none"/>
               </w:rPr>
@@ -323,8 +336,6 @@
                 <w:rFonts w:ascii="Aptos Narrow" w:eastAsia="Times New Roman" w:hAnsi="Aptos Narrow" w:cs="Times New Roman"/>
                 <w:color w:val="000000"/>
                 <w:kern w:val="0"/>
-                <w:sz w:val="22"/>
-                <w:szCs w:val="22"/>
                 <w:lang w:eastAsia="es-CO"/>
                 <w14:ligatures w14:val="none"/>
               </w:rPr>
@@ -334,8 +345,6 @@
                 <w:rFonts w:ascii="Aptos Narrow" w:eastAsia="Times New Roman" w:hAnsi="Aptos Narrow" w:cs="Times New Roman"/>
                 <w:color w:val="000000"/>
                 <w:kern w:val="0"/>
-                <w:sz w:val="22"/>
-                <w:szCs w:val="22"/>
                 <w:lang w:eastAsia="es-CO"/>
                 <w14:ligatures w14:val="none"/>
               </w:rPr>
@@ -355,8 +364,6 @@
                 <w:rFonts w:ascii="Aptos Narrow" w:eastAsia="Times New Roman" w:hAnsi="Aptos Narrow" w:cs="Times New Roman"/>
                 <w:color w:val="000000"/>
                 <w:kern w:val="0"/>
-                <w:sz w:val="22"/>
-                <w:szCs w:val="22"/>
                 <w:lang w:eastAsia="es-CO"/>
                 <w14:ligatures w14:val="none"/>
               </w:rPr>
@@ -366,8 +373,6 @@
                 <w:rFonts w:ascii="Aptos Narrow" w:eastAsia="Times New Roman" w:hAnsi="Aptos Narrow" w:cs="Times New Roman"/>
                 <w:color w:val="000000"/>
                 <w:kern w:val="0"/>
-                <w:sz w:val="22"/>
-                <w:szCs w:val="22"/>
                 <w:lang w:eastAsia="es-CO"/>
                 <w14:ligatures w14:val="none"/>
               </w:rPr>
@@ -392,8 +397,6 @@
                 <w:rFonts w:ascii="Aptos Narrow" w:eastAsia="Times New Roman" w:hAnsi="Aptos Narrow" w:cs="Times New Roman"/>
                 <w:color w:val="000000"/>
                 <w:kern w:val="0"/>
-                <w:sz w:val="22"/>
-                <w:szCs w:val="22"/>
                 <w:lang w:eastAsia="es-CO"/>
                 <w14:ligatures w14:val="none"/>
               </w:rPr>
@@ -403,8 +406,6 @@
                 <w:rFonts w:ascii="Aptos Narrow" w:eastAsia="Times New Roman" w:hAnsi="Aptos Narrow" w:cs="Times New Roman"/>
                 <w:color w:val="000000"/>
                 <w:kern w:val="0"/>
-                <w:sz w:val="22"/>
-                <w:szCs w:val="22"/>
                 <w:lang w:eastAsia="es-CO"/>
                 <w14:ligatures w14:val="none"/>
               </w:rPr>
@@ -424,8 +425,6 @@
                 <w:rFonts w:ascii="Aptos Narrow" w:eastAsia="Times New Roman" w:hAnsi="Aptos Narrow" w:cs="Times New Roman"/>
                 <w:color w:val="000000"/>
                 <w:kern w:val="0"/>
-                <w:sz w:val="22"/>
-                <w:szCs w:val="22"/>
                 <w:lang w:eastAsia="es-CO"/>
                 <w14:ligatures w14:val="none"/>
               </w:rPr>
@@ -435,8 +434,6 @@
                 <w:rFonts w:ascii="Aptos Narrow" w:eastAsia="Times New Roman" w:hAnsi="Aptos Narrow" w:cs="Times New Roman"/>
                 <w:color w:val="000000"/>
                 <w:kern w:val="0"/>
-                <w:sz w:val="22"/>
-                <w:szCs w:val="22"/>
                 <w:lang w:eastAsia="es-CO"/>
                 <w14:ligatures w14:val="none"/>
               </w:rPr>
@@ -461,8 +458,6 @@
                 <w:rFonts w:ascii="Aptos Narrow" w:eastAsia="Times New Roman" w:hAnsi="Aptos Narrow" w:cs="Times New Roman"/>
                 <w:color w:val="000000"/>
                 <w:kern w:val="0"/>
-                <w:sz w:val="22"/>
-                <w:szCs w:val="22"/>
                 <w:lang w:eastAsia="es-CO"/>
                 <w14:ligatures w14:val="none"/>
               </w:rPr>
@@ -472,8 +467,6 @@
                 <w:rFonts w:ascii="Aptos Narrow" w:eastAsia="Times New Roman" w:hAnsi="Aptos Narrow" w:cs="Times New Roman"/>
                 <w:color w:val="000000"/>
                 <w:kern w:val="0"/>
-                <w:sz w:val="22"/>
-                <w:szCs w:val="22"/>
                 <w:lang w:eastAsia="es-CO"/>
                 <w14:ligatures w14:val="none"/>
               </w:rPr>
@@ -493,8 +486,6 @@
                 <w:rFonts w:ascii="Aptos Narrow" w:eastAsia="Times New Roman" w:hAnsi="Aptos Narrow" w:cs="Times New Roman"/>
                 <w:color w:val="000000"/>
                 <w:kern w:val="0"/>
-                <w:sz w:val="22"/>
-                <w:szCs w:val="22"/>
                 <w:lang w:eastAsia="es-CO"/>
                 <w14:ligatures w14:val="none"/>
               </w:rPr>
@@ -504,8 +495,6 @@
                 <w:rFonts w:ascii="Aptos Narrow" w:eastAsia="Times New Roman" w:hAnsi="Aptos Narrow" w:cs="Times New Roman"/>
                 <w:color w:val="000000"/>
                 <w:kern w:val="0"/>
-                <w:sz w:val="22"/>
-                <w:szCs w:val="22"/>
                 <w:lang w:eastAsia="es-CO"/>
                 <w14:ligatures w14:val="none"/>
               </w:rPr>
@@ -530,8 +519,6 @@
                 <w:rFonts w:ascii="Aptos Narrow" w:eastAsia="Times New Roman" w:hAnsi="Aptos Narrow" w:cs="Times New Roman"/>
                 <w:color w:val="000000"/>
                 <w:kern w:val="0"/>
-                <w:sz w:val="22"/>
-                <w:szCs w:val="22"/>
                 <w:lang w:eastAsia="es-CO"/>
                 <w14:ligatures w14:val="none"/>
               </w:rPr>
@@ -541,8 +528,6 @@
                 <w:rFonts w:ascii="Aptos Narrow" w:eastAsia="Times New Roman" w:hAnsi="Aptos Narrow" w:cs="Times New Roman"/>
                 <w:color w:val="000000"/>
                 <w:kern w:val="0"/>
-                <w:sz w:val="22"/>
-                <w:szCs w:val="22"/>
                 <w:lang w:eastAsia="es-CO"/>
                 <w14:ligatures w14:val="none"/>
               </w:rPr>
@@ -562,8 +547,6 @@
                 <w:rFonts w:ascii="Aptos Narrow" w:eastAsia="Times New Roman" w:hAnsi="Aptos Narrow" w:cs="Times New Roman"/>
                 <w:color w:val="000000"/>
                 <w:kern w:val="0"/>
-                <w:sz w:val="22"/>
-                <w:szCs w:val="22"/>
                 <w:lang w:eastAsia="es-CO"/>
                 <w14:ligatures w14:val="none"/>
               </w:rPr>
@@ -573,8 +556,6 @@
                 <w:rFonts w:ascii="Aptos Narrow" w:eastAsia="Times New Roman" w:hAnsi="Aptos Narrow" w:cs="Times New Roman"/>
                 <w:color w:val="000000"/>
                 <w:kern w:val="0"/>
-                <w:sz w:val="22"/>
-                <w:szCs w:val="22"/>
                 <w:lang w:eastAsia="es-CO"/>
                 <w14:ligatures w14:val="none"/>
               </w:rPr>
@@ -586,8 +567,6 @@
                 <w:rFonts w:ascii="Aptos Narrow" w:eastAsia="Times New Roman" w:hAnsi="Aptos Narrow" w:cs="Times New Roman"/>
                 <w:color w:val="000000"/>
                 <w:kern w:val="0"/>
-                <w:sz w:val="22"/>
-                <w:szCs w:val="22"/>
                 <w:lang w:eastAsia="es-CO"/>
                 <w14:ligatures w14:val="none"/>
               </w:rPr>
@@ -599,8 +578,6 @@
                 <w:rFonts w:ascii="Aptos Narrow" w:eastAsia="Times New Roman" w:hAnsi="Aptos Narrow" w:cs="Times New Roman"/>
                 <w:color w:val="000000"/>
                 <w:kern w:val="0"/>
-                <w:sz w:val="22"/>
-                <w:szCs w:val="22"/>
                 <w:lang w:eastAsia="es-CO"/>
                 <w14:ligatures w14:val="none"/>
               </w:rPr>
@@ -625,8 +602,6 @@
                 <w:rFonts w:ascii="Aptos Narrow" w:eastAsia="Times New Roman" w:hAnsi="Aptos Narrow" w:cs="Times New Roman"/>
                 <w:color w:val="000000"/>
                 <w:kern w:val="0"/>
-                <w:sz w:val="22"/>
-                <w:szCs w:val="22"/>
                 <w:lang w:eastAsia="es-CO"/>
                 <w14:ligatures w14:val="none"/>
               </w:rPr>
@@ -636,8 +611,6 @@
                 <w:rFonts w:ascii="Aptos Narrow" w:eastAsia="Times New Roman" w:hAnsi="Aptos Narrow" w:cs="Times New Roman"/>
                 <w:color w:val="000000"/>
                 <w:kern w:val="0"/>
-                <w:sz w:val="22"/>
-                <w:szCs w:val="22"/>
                 <w:lang w:eastAsia="es-CO"/>
                 <w14:ligatures w14:val="none"/>
               </w:rPr>
@@ -657,8 +630,6 @@
                 <w:rFonts w:ascii="Aptos Narrow" w:eastAsia="Times New Roman" w:hAnsi="Aptos Narrow" w:cs="Times New Roman"/>
                 <w:color w:val="000000"/>
                 <w:kern w:val="0"/>
-                <w:sz w:val="22"/>
-                <w:szCs w:val="22"/>
                 <w:lang w:eastAsia="es-CO"/>
                 <w14:ligatures w14:val="none"/>
               </w:rPr>
@@ -668,8 +639,6 @@
                 <w:rFonts w:ascii="Aptos Narrow" w:eastAsia="Times New Roman" w:hAnsi="Aptos Narrow" w:cs="Times New Roman"/>
                 <w:color w:val="000000"/>
                 <w:kern w:val="0"/>
-                <w:sz w:val="22"/>
-                <w:szCs w:val="22"/>
                 <w:lang w:eastAsia="es-CO"/>
                 <w14:ligatures w14:val="none"/>
               </w:rPr>
@@ -681,8 +650,6 @@
                 <w:rFonts w:ascii="Aptos Narrow" w:eastAsia="Times New Roman" w:hAnsi="Aptos Narrow" w:cs="Times New Roman"/>
                 <w:color w:val="000000"/>
                 <w:kern w:val="0"/>
-                <w:sz w:val="22"/>
-                <w:szCs w:val="22"/>
                 <w:lang w:eastAsia="es-CO"/>
                 <w14:ligatures w14:val="none"/>
               </w:rPr>
@@ -694,8 +661,6 @@
                 <w:rFonts w:ascii="Aptos Narrow" w:eastAsia="Times New Roman" w:hAnsi="Aptos Narrow" w:cs="Times New Roman"/>
                 <w:color w:val="000000"/>
                 <w:kern w:val="0"/>
-                <w:sz w:val="22"/>
-                <w:szCs w:val="22"/>
                 <w:lang w:eastAsia="es-CO"/>
                 <w14:ligatures w14:val="none"/>
               </w:rPr>
@@ -707,8 +672,6 @@
                 <w:rFonts w:ascii="Aptos Narrow" w:eastAsia="Times New Roman" w:hAnsi="Aptos Narrow" w:cs="Times New Roman"/>
                 <w:color w:val="000000"/>
                 <w:kern w:val="0"/>
-                <w:sz w:val="22"/>
-                <w:szCs w:val="22"/>
                 <w:lang w:eastAsia="es-CO"/>
                 <w14:ligatures w14:val="none"/>
               </w:rPr>
@@ -720,8 +683,6 @@
                 <w:rFonts w:ascii="Aptos Narrow" w:eastAsia="Times New Roman" w:hAnsi="Aptos Narrow" w:cs="Times New Roman"/>
                 <w:color w:val="000000"/>
                 <w:kern w:val="0"/>
-                <w:sz w:val="22"/>
-                <w:szCs w:val="22"/>
                 <w:lang w:eastAsia="es-CO"/>
                 <w14:ligatures w14:val="none"/>
               </w:rPr>
@@ -733,8 +694,6 @@
                 <w:rFonts w:ascii="Aptos Narrow" w:eastAsia="Times New Roman" w:hAnsi="Aptos Narrow" w:cs="Times New Roman"/>
                 <w:color w:val="000000"/>
                 <w:kern w:val="0"/>
-                <w:sz w:val="22"/>
-                <w:szCs w:val="22"/>
                 <w:lang w:eastAsia="es-CO"/>
                 <w14:ligatures w14:val="none"/>
               </w:rPr>
@@ -746,8 +705,6 @@
                 <w:rFonts w:ascii="Aptos Narrow" w:eastAsia="Times New Roman" w:hAnsi="Aptos Narrow" w:cs="Times New Roman"/>
                 <w:color w:val="000000"/>
                 <w:kern w:val="0"/>
-                <w:sz w:val="22"/>
-                <w:szCs w:val="22"/>
                 <w:lang w:eastAsia="es-CO"/>
                 <w14:ligatures w14:val="none"/>
               </w:rPr>
@@ -772,8 +729,6 @@
                 <w:rFonts w:ascii="Aptos Narrow" w:eastAsia="Times New Roman" w:hAnsi="Aptos Narrow" w:cs="Times New Roman"/>
                 <w:color w:val="000000"/>
                 <w:kern w:val="0"/>
-                <w:sz w:val="22"/>
-                <w:szCs w:val="22"/>
                 <w:lang w:eastAsia="es-CO"/>
                 <w14:ligatures w14:val="none"/>
               </w:rPr>
@@ -783,8 +738,6 @@
                 <w:rFonts w:ascii="Aptos Narrow" w:eastAsia="Times New Roman" w:hAnsi="Aptos Narrow" w:cs="Times New Roman"/>
                 <w:color w:val="000000"/>
                 <w:kern w:val="0"/>
-                <w:sz w:val="22"/>
-                <w:szCs w:val="22"/>
                 <w:lang w:eastAsia="es-CO"/>
                 <w14:ligatures w14:val="none"/>
               </w:rPr>
@@ -804,8 +757,6 @@
                 <w:rFonts w:ascii="Aptos Narrow" w:eastAsia="Times New Roman" w:hAnsi="Aptos Narrow" w:cs="Times New Roman"/>
                 <w:color w:val="000000"/>
                 <w:kern w:val="0"/>
-                <w:sz w:val="22"/>
-                <w:szCs w:val="22"/>
                 <w:lang w:eastAsia="es-CO"/>
                 <w14:ligatures w14:val="none"/>
               </w:rPr>
@@ -815,8 +766,6 @@
                 <w:rFonts w:ascii="Aptos Narrow" w:eastAsia="Times New Roman" w:hAnsi="Aptos Narrow" w:cs="Times New Roman"/>
                 <w:color w:val="000000"/>
                 <w:kern w:val="0"/>
-                <w:sz w:val="22"/>
-                <w:szCs w:val="22"/>
                 <w:lang w:eastAsia="es-CO"/>
                 <w14:ligatures w14:val="none"/>
               </w:rPr>
@@ -828,8 +777,6 @@
                 <w:rFonts w:ascii="Aptos Narrow" w:eastAsia="Times New Roman" w:hAnsi="Aptos Narrow" w:cs="Times New Roman"/>
                 <w:color w:val="000000"/>
                 <w:kern w:val="0"/>
-                <w:sz w:val="22"/>
-                <w:szCs w:val="22"/>
                 <w:lang w:eastAsia="es-CO"/>
                 <w14:ligatures w14:val="none"/>
               </w:rPr>
@@ -841,8 +788,6 @@
                 <w:rFonts w:ascii="Aptos Narrow" w:eastAsia="Times New Roman" w:hAnsi="Aptos Narrow" w:cs="Times New Roman"/>
                 <w:color w:val="000000"/>
                 <w:kern w:val="0"/>
-                <w:sz w:val="22"/>
-                <w:szCs w:val="22"/>
                 <w:lang w:eastAsia="es-CO"/>
                 <w14:ligatures w14:val="none"/>
               </w:rPr>
@@ -867,8 +812,6 @@
                 <w:rFonts w:ascii="Aptos Narrow" w:eastAsia="Times New Roman" w:hAnsi="Aptos Narrow" w:cs="Times New Roman"/>
                 <w:color w:val="000000"/>
                 <w:kern w:val="0"/>
-                <w:sz w:val="22"/>
-                <w:szCs w:val="22"/>
                 <w:lang w:eastAsia="es-CO"/>
                 <w14:ligatures w14:val="none"/>
               </w:rPr>
@@ -878,8 +821,6 @@
                 <w:rFonts w:ascii="Aptos Narrow" w:eastAsia="Times New Roman" w:hAnsi="Aptos Narrow" w:cs="Times New Roman"/>
                 <w:color w:val="000000"/>
                 <w:kern w:val="0"/>
-                <w:sz w:val="22"/>
-                <w:szCs w:val="22"/>
                 <w:lang w:eastAsia="es-CO"/>
                 <w14:ligatures w14:val="none"/>
               </w:rPr>
@@ -899,8 +840,6 @@
                 <w:rFonts w:ascii="Aptos Narrow" w:eastAsia="Times New Roman" w:hAnsi="Aptos Narrow" w:cs="Times New Roman"/>
                 <w:color w:val="000000"/>
                 <w:kern w:val="0"/>
-                <w:sz w:val="22"/>
-                <w:szCs w:val="22"/>
                 <w:lang w:eastAsia="es-CO"/>
                 <w14:ligatures w14:val="none"/>
               </w:rPr>
@@ -910,8 +849,6 @@
                 <w:rFonts w:ascii="Aptos Narrow" w:eastAsia="Times New Roman" w:hAnsi="Aptos Narrow" w:cs="Times New Roman"/>
                 <w:color w:val="000000"/>
                 <w:kern w:val="0"/>
-                <w:sz w:val="22"/>
-                <w:szCs w:val="22"/>
                 <w:lang w:eastAsia="es-CO"/>
                 <w14:ligatures w14:val="none"/>
               </w:rPr>
@@ -923,8 +860,6 @@
                 <w:rFonts w:ascii="Aptos Narrow" w:eastAsia="Times New Roman" w:hAnsi="Aptos Narrow" w:cs="Times New Roman"/>
                 <w:color w:val="000000"/>
                 <w:kern w:val="0"/>
-                <w:sz w:val="22"/>
-                <w:szCs w:val="22"/>
                 <w:lang w:eastAsia="es-CO"/>
                 <w14:ligatures w14:val="none"/>
               </w:rPr>
@@ -936,8 +871,6 @@
                 <w:rFonts w:ascii="Aptos Narrow" w:eastAsia="Times New Roman" w:hAnsi="Aptos Narrow" w:cs="Times New Roman"/>
                 <w:color w:val="000000"/>
                 <w:kern w:val="0"/>
-                <w:sz w:val="22"/>
-                <w:szCs w:val="22"/>
                 <w:lang w:eastAsia="es-CO"/>
                 <w14:ligatures w14:val="none"/>
               </w:rPr>
@@ -962,8 +895,6 @@
                 <w:rFonts w:ascii="Aptos Narrow" w:eastAsia="Times New Roman" w:hAnsi="Aptos Narrow" w:cs="Times New Roman"/>
                 <w:color w:val="000000"/>
                 <w:kern w:val="0"/>
-                <w:sz w:val="22"/>
-                <w:szCs w:val="22"/>
                 <w:lang w:eastAsia="es-CO"/>
                 <w14:ligatures w14:val="none"/>
               </w:rPr>
@@ -973,8 +904,6 @@
                 <w:rFonts w:ascii="Aptos Narrow" w:eastAsia="Times New Roman" w:hAnsi="Aptos Narrow" w:cs="Times New Roman"/>
                 <w:color w:val="000000"/>
                 <w:kern w:val="0"/>
-                <w:sz w:val="22"/>
-                <w:szCs w:val="22"/>
                 <w:lang w:eastAsia="es-CO"/>
                 <w14:ligatures w14:val="none"/>
               </w:rPr>
@@ -994,8 +923,6 @@
                 <w:rFonts w:ascii="Aptos Narrow" w:eastAsia="Times New Roman" w:hAnsi="Aptos Narrow" w:cs="Times New Roman"/>
                 <w:color w:val="000000"/>
                 <w:kern w:val="0"/>
-                <w:sz w:val="22"/>
-                <w:szCs w:val="22"/>
                 <w:lang w:eastAsia="es-CO"/>
                 <w14:ligatures w14:val="none"/>
               </w:rPr>
@@ -1005,8 +932,6 @@
                 <w:rFonts w:ascii="Aptos Narrow" w:eastAsia="Times New Roman" w:hAnsi="Aptos Narrow" w:cs="Times New Roman"/>
                 <w:color w:val="000000"/>
                 <w:kern w:val="0"/>
-                <w:sz w:val="22"/>
-                <w:szCs w:val="22"/>
                 <w:lang w:eastAsia="es-CO"/>
                 <w14:ligatures w14:val="none"/>
               </w:rPr>
@@ -1031,8 +956,6 @@
                 <w:rFonts w:ascii="Aptos Narrow" w:eastAsia="Times New Roman" w:hAnsi="Aptos Narrow" w:cs="Times New Roman"/>
                 <w:color w:val="000000"/>
                 <w:kern w:val="0"/>
-                <w:sz w:val="22"/>
-                <w:szCs w:val="22"/>
                 <w:lang w:eastAsia="es-CO"/>
                 <w14:ligatures w14:val="none"/>
               </w:rPr>
@@ -1042,8 +965,6 @@
                 <w:rFonts w:ascii="Aptos Narrow" w:eastAsia="Times New Roman" w:hAnsi="Aptos Narrow" w:cs="Times New Roman"/>
                 <w:color w:val="000000"/>
                 <w:kern w:val="0"/>
-                <w:sz w:val="22"/>
-                <w:szCs w:val="22"/>
                 <w:lang w:eastAsia="es-CO"/>
                 <w14:ligatures w14:val="none"/>
               </w:rPr>
@@ -1063,8 +984,6 @@
                 <w:rFonts w:ascii="Aptos Narrow" w:eastAsia="Times New Roman" w:hAnsi="Aptos Narrow" w:cs="Times New Roman"/>
                 <w:color w:val="000000"/>
                 <w:kern w:val="0"/>
-                <w:sz w:val="22"/>
-                <w:szCs w:val="22"/>
                 <w:lang w:eastAsia="es-CO"/>
                 <w14:ligatures w14:val="none"/>
               </w:rPr>
@@ -1074,8 +993,6 @@
                 <w:rFonts w:ascii="Aptos Narrow" w:eastAsia="Times New Roman" w:hAnsi="Aptos Narrow" w:cs="Times New Roman"/>
                 <w:color w:val="000000"/>
                 <w:kern w:val="0"/>
-                <w:sz w:val="22"/>
-                <w:szCs w:val="22"/>
                 <w:lang w:eastAsia="es-CO"/>
                 <w14:ligatures w14:val="none"/>
               </w:rPr>
@@ -1087,8 +1004,6 @@
                 <w:rFonts w:ascii="Aptos Narrow" w:eastAsia="Times New Roman" w:hAnsi="Aptos Narrow" w:cs="Times New Roman"/>
                 <w:color w:val="000000"/>
                 <w:kern w:val="0"/>
-                <w:sz w:val="22"/>
-                <w:szCs w:val="22"/>
                 <w:lang w:eastAsia="es-CO"/>
                 <w14:ligatures w14:val="none"/>
               </w:rPr>
@@ -1100,8 +1015,6 @@
                 <w:rFonts w:ascii="Aptos Narrow" w:eastAsia="Times New Roman" w:hAnsi="Aptos Narrow" w:cs="Times New Roman"/>
                 <w:color w:val="000000"/>
                 <w:kern w:val="0"/>
-                <w:sz w:val="22"/>
-                <w:szCs w:val="22"/>
                 <w:lang w:eastAsia="es-CO"/>
                 <w14:ligatures w14:val="none"/>
               </w:rPr>
@@ -1173,6 +1086,33 @@
     <w:p>
       <w:pPr>
         <w:spacing w:after="0"/>
+        <w:rPr>
+          <w:b/>
+          <w:bCs/>
+        </w:rPr>
+      </w:pPr>
+    </w:p>
+    <w:p>
+      <w:pPr>
+        <w:spacing w:after="0"/>
+        <w:rPr>
+          <w:b/>
+          <w:bCs/>
+        </w:rPr>
+      </w:pPr>
+    </w:p>
+    <w:p>
+      <w:pPr>
+        <w:spacing w:after="0"/>
+        <w:rPr>
+          <w:b/>
+          <w:bCs/>
+        </w:rPr>
+      </w:pPr>
+    </w:p>
+    <w:p>
+      <w:pPr>
+        <w:spacing w:after="0"/>
       </w:pPr>
       <w:r>
         <w:rPr>
@@ -1214,11 +1154,7 @@
       </w:r>
       <w:proofErr w:type="spellEnd"/>
       <w:r>
-        <w:t xml:space="preserve">) que reciba un ID de reporte y filtros, retornando un JSON listo </w:t>
-      </w:r>
-      <w:r>
-        <w:lastRenderedPageBreak/>
-        <w:t>para pintar en pantalla. Este contrato debe congelarse temprano porque tareas como la T2, T3, T4, T5 y T7 van a consumir esta API. Si se cambia la forma de los datos más adelante, romperá los componentes de sus compañeros.</w:t>
+        <w:t>) que reciba un ID de reporte y filtros, retornando un JSON listo para pintar en pantalla. Este contrato debe congelarse temprano porque tareas como la T2, T3, T4, T5 y T7 van a consumir esta API. Si se cambia la forma de los datos más adelante, romperá los componentes de sus compañeros.</w:t>
       </w:r>
     </w:p>
     <w:p>
@@ -1469,7 +1405,7 @@
               <w:rPr>
                 <w:lang w:eastAsia="es-CO"/>
               </w:rPr>
-              <w:t>E1</w:t>
+              <w:t>Edison Vanegas</w:t>
             </w:r>
           </w:p>
         </w:tc>
@@ -1580,7 +1516,7 @@
               <w:rPr>
                 <w:lang w:eastAsia="es-CO"/>
               </w:rPr>
-              <w:t>E2</w:t>
+              <w:t>Andrea Ortiz</w:t>
             </w:r>
           </w:p>
         </w:tc>
@@ -1670,6 +1606,7 @@
               <w:rPr>
                 <w:lang w:eastAsia="es-CO"/>
               </w:rPr>
+              <w:lastRenderedPageBreak/>
               <w:t>Yisleza</w:t>
             </w:r>
             <w:proofErr w:type="spellEnd"/>
@@ -1760,8 +1697,16 @@
               <w:rPr>
                 <w:lang w:eastAsia="es-CO"/>
               </w:rPr>
-              <w:t>E4</w:t>
-            </w:r>
+              <w:t xml:space="preserve">Santiago </w:t>
+            </w:r>
+            <w:proofErr w:type="spellStart"/>
+            <w:r>
+              <w:rPr>
+                <w:lang w:eastAsia="es-CO"/>
+              </w:rPr>
+              <w:t>Jimenez</w:t>
+            </w:r>
+            <w:proofErr w:type="spellEnd"/>
           </w:p>
         </w:tc>
         <w:tc>
@@ -1802,7 +1747,13 @@
               <w:rPr>
                 <w:lang w:eastAsia="es-CO"/>
               </w:rPr>
-              <w:t>T7</w:t>
+              <w:t>T</w:t>
+            </w:r>
+            <w:r>
+              <w:rPr>
+                <w:lang w:eastAsia="es-CO"/>
+              </w:rPr>
+              <w:t>6</w:t>
             </w:r>
           </w:p>
         </w:tc>
@@ -1850,7 +1801,6 @@
               <w:rPr>
                 <w:lang w:eastAsia="es-CO"/>
               </w:rPr>
-              <w:lastRenderedPageBreak/>
               <w:t>Rudexxy</w:t>
             </w:r>
             <w:proofErr w:type="spellEnd"/>
@@ -2044,7 +1994,7 @@
               <w:rPr>
                 <w:lang w:eastAsia="es-CO"/>
               </w:rPr>
-              <w:t>E7</w:t>
+              <w:t>Valentina Diaz</w:t>
             </w:r>
           </w:p>
         </w:tc>
@@ -2133,7 +2083,7 @@
               <w:rPr>
                 <w:lang w:eastAsia="es-CO"/>
               </w:rPr>
-              <w:t>E8</w:t>
+              <w:t>Santiago García</w:t>
             </w:r>
           </w:p>
         </w:tc>
@@ -2215,6 +2165,10 @@
     <w:p>
       <w:pPr>
         <w:spacing w:after="0"/>
+        <w:rPr>
+          <w:b/>
+          <w:bCs/>
+        </w:rPr>
       </w:pPr>
       <w:r>
         <w:rPr>
@@ -2223,6 +2177,11 @@
         </w:rPr>
         <w:t>¿Cuándo cantamos victoria?</w:t>
       </w:r>
+    </w:p>
+    <w:p>
+      <w:pPr>
+        <w:spacing w:after="0"/>
+      </w:pPr>
     </w:p>
     <w:p>
       <w:pPr>
@@ -2294,6 +2253,7 @@
         <w:spacing w:after="0"/>
       </w:pPr>
       <w:r>
+        <w:lastRenderedPageBreak/>
         <w:t>Los dos estudiantes encargados de la UI general hayan completado la homogeneización.</w:t>
       </w:r>
     </w:p>
@@ -2382,7 +2342,6 @@
           <w:b/>
           <w:bCs/>
         </w:rPr>
-        <w:lastRenderedPageBreak/>
         <w:t>Épica 1: Visualización de Reportes Académicos</w:t>
       </w:r>
     </w:p>
@@ -2666,8 +2625,36 @@
         <w:spacing w:after="0"/>
       </w:pPr>
       <w:r>
+        <w:lastRenderedPageBreak/>
         <w:t>La tabla debe mostrar la lista de estudiantes del curso con sus respectivas calificaciones.</w:t>
       </w:r>
+    </w:p>
+    <w:p>
+      <w:pPr>
+        <w:spacing w:after="0"/>
+        <w:rPr>
+          <w:b/>
+          <w:bCs/>
+        </w:rPr>
+      </w:pPr>
+    </w:p>
+    <w:p>
+      <w:pPr>
+        <w:spacing w:after="0"/>
+        <w:rPr>
+          <w:b/>
+          <w:bCs/>
+        </w:rPr>
+      </w:pPr>
+    </w:p>
+    <w:p>
+      <w:pPr>
+        <w:spacing w:after="0"/>
+        <w:rPr>
+          <w:b/>
+          <w:bCs/>
+        </w:rPr>
+      </w:pPr>
     </w:p>
     <w:p>
       <w:pPr>
@@ -2762,7 +2749,6 @@
         <w:spacing w:after="0"/>
       </w:pPr>
       <w:r>
-        <w:lastRenderedPageBreak/>
         <w:t xml:space="preserve">Debe mostrar los </w:t>
       </w:r>
       <w:proofErr w:type="spellStart"/>
@@ -2965,67 +2951,7 @@
           <w:b/>
           <w:bCs/>
         </w:rPr>
-        <w:t>Historia de Usuario 5 (T6): Contrato de Servicios de Datos (</w:t>
-      </w:r>
-      <w:proofErr w:type="spellStart"/>
-      <w:r>
-        <w:rPr>
-          <w:b/>
-          <w:bCs/>
-        </w:rPr>
-        <w:t>Enabler</w:t>
-      </w:r>
-      <w:proofErr w:type="spellEnd"/>
-      <w:r>
-        <w:rPr>
-          <w:b/>
-          <w:bCs/>
-        </w:rPr>
-        <w:t>/</w:t>
-      </w:r>
-      <w:proofErr w:type="spellStart"/>
-      <w:r>
-        <w:rPr>
-          <w:b/>
-          <w:bCs/>
-        </w:rPr>
-        <w:t>Technical</w:t>
-      </w:r>
-      <w:proofErr w:type="spellEnd"/>
-      <w:r>
-        <w:rPr>
-          <w:b/>
-          <w:bCs/>
-        </w:rPr>
-        <w:t xml:space="preserve"> Story)</w:t>
-      </w:r>
-    </w:p>
-    <w:p>
-      <w:pPr>
-        <w:spacing w:after="0"/>
-      </w:pPr>
-      <w:r>
-        <w:rPr>
-          <w:i/>
-          <w:iCs/>
-        </w:rPr>
-        <w:t>Nota: En metodologías ágiles, las tareas puramente técnicas que habilitan otras funciones se manejan como "</w:t>
-      </w:r>
-      <w:proofErr w:type="spellStart"/>
-      <w:r>
-        <w:rPr>
-          <w:i/>
-          <w:iCs/>
-        </w:rPr>
-        <w:t>Enablers</w:t>
-      </w:r>
-      <w:proofErr w:type="spellEnd"/>
-      <w:r>
-        <w:rPr>
-          <w:i/>
-          <w:iCs/>
-        </w:rPr>
-        <w:t>" o Historias Técnicas.</w:t>
+        <w:t xml:space="preserve">Historia de Usuario 5 (T6): Contrato de Servicios de Datos </w:t>
       </w:r>
     </w:p>
     <w:p>
@@ -3100,6 +3026,7 @@
         <w:spacing w:after="0"/>
       </w:pPr>
       <w:r>
+        <w:lastRenderedPageBreak/>
         <w:t xml:space="preserve">La función </w:t>
       </w:r>
       <w:proofErr w:type="spellStart"/>
@@ -3257,7 +3184,6 @@
           <w:b/>
           <w:bCs/>
         </w:rPr>
-        <w:lastRenderedPageBreak/>
         <w:t>Como</w:t>
       </w:r>
       <w:r>
@@ -3550,6 +3476,7 @@
           <w:b/>
           <w:bCs/>
         </w:rPr>
+        <w:lastRenderedPageBreak/>
         <w:t>Historia de Usuario 8 (T10): Adaptabilidad a Dispositivos (Responsive)</w:t>
       </w:r>
     </w:p>
@@ -3629,7 +3556,6 @@
         <w:spacing w:after="0"/>
       </w:pPr>
       <w:r>
-        <w:lastRenderedPageBreak/>
         <w:t xml:space="preserve">Las tablas de reportes deben poder desplazarse horizontalmente o adaptarse en pantallas pequeñas sin romper el </w:t>
       </w:r>
       <w:proofErr w:type="spellStart"/>
@@ -6072,6 +5998,7 @@
   <w:style w:type="character" w:default="1" w:styleId="Fuentedeprrafopredeter">
     <w:name w:val="Default Paragraph Font"/>
     <w:uiPriority w:val="1"/>
+    <w:semiHidden/>
     <w:unhideWhenUsed/>
   </w:style>
   <w:style w:type="table" w:default="1" w:styleId="Tablanormal">

</xml_diff>